<commit_message>
WF-02: record the decision to leave it as built
Deliberate deferral, not an unnoticed bug. Recorded as such so a future session
does not find the drip_bypass gate, recognise it as misplaced, and change it
unprompted. Also recorded what would make it worth revisiting: rising magnet
volume, a second person handling leads since BCC visibility is Scott's alone and
does not transfer, or any triage change that assumes a consolidated alert exists.

Co-Authored-By: Claude Opus 5 <noreply@anthropic.com>
</commit_message>
<xml_diff>
--- a/campaigns/WF-02-five-minute-sms.docx
+++ b/campaigns/WF-02-five-minute-sms.docx
@@ -1333,10 +1333,21 @@
           <w:b/>
           <w:bCs/>
         </w:rPr>
-        <w:t xml:space="preserve">Awaiting Scott’s decision</w:t>
-      </w:r>
-      <w:r>
-        <w:t xml:space="preserve">, because removing</w:t>
+        <w:t xml:space="preserve">DECISION, Scott, Aug 4, 2026: leave WF-02 as built for now.</w:t>
+      </w:r>
+      <w:r>
+        <w:t xml:space="preserve"> </w:t>
+      </w:r>
+      <w:r>
+        <w:t xml:space="preserve">Not an oversight, a deliberate deferral. Recorded so a future session does not treat this as an unnoticed bug and change it unprompted.</w:t>
+      </w:r>
+    </w:p>
+    <w:p>
+      <w:pPr>
+        <w:pStyle w:val="BodyText"/>
+      </w:pPr>
+      <w:r>
+        <w:t xml:space="preserve">The reasoning behind the deferral: Scott is BCC’d on all outbound drip email, so no lead is invisible today, and the change would alter who receives a text, which is not a change worth making in passing. The two options remain as written above, removing</w:t>
       </w:r>
       <w:r>
         <w:t xml:space="preserve"> </w:t>
@@ -1351,22 +1362,25 @@
         <w:t xml:space="preserve"> </w:t>
       </w:r>
       <w:r>
-        <w:t xml:space="preserve">means magnet leads start receiving the 5-minute SMS where they have consented. The conservative alternative is to keep the SMS gated on</w:t>
-      </w:r>
-      <w:r>
-        <w:t xml:space="preserve"> </w:t>
-      </w:r>
-      <w:r>
-        <w:rPr>
-          <w:rStyle w:val="VerbatimChar"/>
-        </w:rPr>
-        <w:t xml:space="preserve">drip_bypass</w:t>
-      </w:r>
-      <w:r>
-        <w:t xml:space="preserve"> </w:t>
-      </w:r>
-      <w:r>
-        <w:t xml:space="preserve">and move only the alert.</w:t>
+        <w:t xml:space="preserve">entirely or moving only the alert.</w:t>
+      </w:r>
+    </w:p>
+    <w:p>
+      <w:pPr>
+        <w:pStyle w:val="BodyText"/>
+      </w:pPr>
+      <w:r>
+        <w:rPr>
+          <w:b/>
+          <w:bCs/>
+        </w:rPr>
+        <w:t xml:space="preserve">What would make this worth revisiting.</w:t>
+      </w:r>
+      <w:r>
+        <w:t xml:space="preserve"> </w:t>
+      </w:r>
+      <w:r>
+        <w:t xml:space="preserve">Magnet volume rising, since the alert gap scales with it. A second person handling leads, since BCC visibility is Scott’s alone and does not transfer. Or any change to how leads are triaged that assumes a consolidated new-lead alert exists.</w:t>
       </w:r>
     </w:p>
     <w:p>

</xml_diff>